<commit_message>
edit plan de validation
</commit_message>
<xml_diff>
--- a/Projet/Plan_de_Validation.docx
+++ b/Projet/Plan_de_Validation.docx
@@ -50,8 +50,8 @@
         <w:tblLook w:firstRow="1" w:noVBand="1" w:lastRow="0" w:firstColumn="1" w:lastColumn="0" w:noHBand="0" w:val="04a0"/>
       </w:tblPr>
       <w:tblGrid>
-        <w:gridCol w:w="2130"/>
-        <w:gridCol w:w="7590"/>
+        <w:gridCol w:w="2129"/>
+        <w:gridCol w:w="7591"/>
       </w:tblGrid>
       <w:tr>
         <w:trPr>
@@ -59,7 +59,7 @@
         </w:trPr>
         <w:tc>
           <w:tcPr>
-            <w:tcW w:w="2130" w:type="dxa"/>
+            <w:tcW w:w="2129" w:type="dxa"/>
             <w:tcBorders>
               <w:top w:val="single" w:sz="6" w:space="0" w:color="D9D9D9"/>
               <w:start w:val="single" w:sz="6" w:space="0" w:color="D9D9D9"/>
@@ -88,7 +88,7 @@
         </w:tc>
         <w:tc>
           <w:tcPr>
-            <w:tcW w:w="7590" w:type="dxa"/>
+            <w:tcW w:w="7591" w:type="dxa"/>
             <w:tcBorders>
               <w:top w:val="single" w:sz="6" w:space="0" w:color="D9D9D9"/>
               <w:start w:val="single" w:sz="6" w:space="0" w:color="D9D9D9"/>
@@ -110,16 +110,7 @@
                 <w:color w:val="000000"/>
                 <w:sz w:val="18"/>
               </w:rPr>
-              <w:t>2</w:t>
-            </w:r>
-            <w:r>
-              <w:rPr>
-                <w:rFonts w:eastAsia="Arial"/>
-                <w:b w:val="false"/>
-                <w:color w:val="000000"/>
-                <w:sz w:val="18"/>
-              </w:rPr>
-              <w:t>.0</w:t>
+              <w:t>2.0</w:t>
             </w:r>
           </w:p>
         </w:tc>
@@ -130,7 +121,7 @@
         </w:trPr>
         <w:tc>
           <w:tcPr>
-            <w:tcW w:w="2130" w:type="dxa"/>
+            <w:tcW w:w="2129" w:type="dxa"/>
             <w:tcBorders>
               <w:top w:val="single" w:sz="6" w:space="0" w:color="D9D9D9"/>
               <w:start w:val="single" w:sz="6" w:space="0" w:color="D9D9D9"/>
@@ -159,7 +150,7 @@
         </w:tc>
         <w:tc>
           <w:tcPr>
-            <w:tcW w:w="7590" w:type="dxa"/>
+            <w:tcW w:w="7591" w:type="dxa"/>
             <w:tcBorders>
               <w:top w:val="single" w:sz="6" w:space="0" w:color="D9D9D9"/>
               <w:start w:val="single" w:sz="6" w:space="0" w:color="D9D9D9"/>
@@ -192,7 +183,7 @@
         </w:trPr>
         <w:tc>
           <w:tcPr>
-            <w:tcW w:w="2130" w:type="dxa"/>
+            <w:tcW w:w="2129" w:type="dxa"/>
             <w:tcBorders>
               <w:top w:val="single" w:sz="6" w:space="0" w:color="D9D9D9"/>
               <w:start w:val="single" w:sz="6" w:space="0" w:color="D9D9D9"/>
@@ -221,7 +212,7 @@
         </w:tc>
         <w:tc>
           <w:tcPr>
-            <w:tcW w:w="7590" w:type="dxa"/>
+            <w:tcW w:w="7591" w:type="dxa"/>
             <w:tcBorders>
               <w:top w:val="single" w:sz="6" w:space="0" w:color="D9D9D9"/>
               <w:start w:val="single" w:sz="6" w:space="0" w:color="D9D9D9"/>
@@ -244,68 +235,6 @@
                 <w:sz w:val="18"/>
               </w:rPr>
               <w:t>20260709-SRS-SoC-Tracking__720__0, révision AB du 31 août 2026</w:t>
-            </w:r>
-          </w:p>
-        </w:tc>
-      </w:tr>
-      <w:tr>
-        <w:trPr>
-          <w:cantSplit w:val="true"/>
-        </w:trPr>
-        <w:tc>
-          <w:tcPr>
-            <w:tcW w:w="2130" w:type="dxa"/>
-            <w:tcBorders>
-              <w:top w:val="single" w:sz="6" w:space="0" w:color="D9D9D9"/>
-              <w:start w:val="single" w:sz="6" w:space="0" w:color="D9D9D9"/>
-              <w:bottom w:val="single" w:sz="6" w:space="0" w:color="D9D9D9"/>
-              <w:end w:val="single" w:sz="6" w:space="0" w:color="D9D9D9"/>
-            </w:tcBorders>
-            <w:shd w:fill="EAF1F8" w:val="clear"/>
-            <w:vAlign w:val="center"/>
-          </w:tcPr>
-          <w:p>
-            <w:pPr>
-              <w:pStyle w:val="Normal"/>
-              <w:spacing w:before="0" w:after="0"/>
-              <w:rPr/>
-            </w:pPr>
-            <w:r>
-              <w:rPr>
-                <w:rFonts w:eastAsia="Arial"/>
-                <w:b/>
-                <w:color w:val="000000"/>
-                <w:sz w:val="18"/>
-              </w:rPr>
-              <w:t>Périmètre</w:t>
-            </w:r>
-          </w:p>
-        </w:tc>
-        <w:tc>
-          <w:tcPr>
-            <w:tcW w:w="7590" w:type="dxa"/>
-            <w:tcBorders>
-              <w:top w:val="single" w:sz="6" w:space="0" w:color="D9D9D9"/>
-              <w:start w:val="single" w:sz="6" w:space="0" w:color="D9D9D9"/>
-              <w:bottom w:val="single" w:sz="6" w:space="0" w:color="D9D9D9"/>
-              <w:end w:val="single" w:sz="6" w:space="0" w:color="D9D9D9"/>
-            </w:tcBorders>
-            <w:vAlign w:val="center"/>
-          </w:tcPr>
-          <w:p>
-            <w:pPr>
-              <w:pStyle w:val="Normal"/>
-              <w:spacing w:before="0" w:after="0"/>
-              <w:rPr/>
-            </w:pPr>
-            <w:r>
-              <w:rPr>
-                <w:rFonts w:eastAsia="Arial"/>
-                <w:b w:val="false"/>
-                <w:color w:val="000000"/>
-                <w:sz w:val="18"/>
-              </w:rPr>
-              <w:t>FPGA SoC Tracking - sources vidéo et sortie PMOD VGA</w:t>
             </w:r>
           </w:p>
         </w:tc>
@@ -675,7 +604,25 @@
                 <w:color w:val="000000"/>
                 <w:sz w:val="16"/>
               </w:rPr>
-              <w:t>Émettre une mire vidéo comportant au moins un élément dynamique.</w:t>
+              <w:t xml:space="preserve">Émettre un </w:t>
+            </w:r>
+            <w:r>
+              <w:rPr>
+                <w:rFonts w:eastAsia="Arial"/>
+                <w:b w:val="false"/>
+                <w:color w:val="000000"/>
+                <w:sz w:val="16"/>
+              </w:rPr>
+              <w:t>flux</w:t>
+            </w:r>
+            <w:r>
+              <w:rPr>
+                <w:rFonts w:eastAsia="Arial"/>
+                <w:b w:val="false"/>
+                <w:color w:val="000000"/>
+                <w:sz w:val="16"/>
+              </w:rPr>
+              <w:t xml:space="preserve"> vidéo comportant au moins un élément dynamique.</w:t>
             </w:r>
           </w:p>
         </w:tc>
@@ -745,8 +692,6 @@
                 <w:sz w:val="16"/>
               </w:rPr>
               <w:t>PL-IP-002 (P1)</w:t>
-              <w:br/>
-              <w:t>PL-IP-003 (P2)</w:t>
             </w:r>
           </w:p>
         </w:tc>
@@ -778,7 +723,7 @@
                 <w:color w:val="000000"/>
                 <w:sz w:val="16"/>
               </w:rPr>
-              <w:t>Sélection DMA ou TPG à l’initialisation; vérification distincte du changement à chaud par registre.</w:t>
+              <w:t>Sélection DMA ou TPG à l’initialisation.</w:t>
             </w:r>
           </w:p>
         </w:tc>
@@ -902,7 +847,12 @@
       <w:pPr>
         <w:pStyle w:val="Normal"/>
         <w:spacing w:before="0" w:after="100"/>
-        <w:rPr/>
+        <w:rPr>
+          <w:rFonts w:eastAsia="Arial"/>
+          <w:b w:val="false"/>
+          <w:color w:val="000000"/>
+          <w:sz w:val="20"/>
+        </w:rPr>
       </w:pPr>
       <w:r>
         <w:rPr>
@@ -912,6 +862,72 @@
           <w:sz w:val="20"/>
         </w:rPr>
         <w:t>Hors périmètre : filtres luminance, gaussien et Harris, seuillage, overlay, retour UART, alimentation de la DDR et chargement automatique depuis carte SD. La chaîne intégrée n’est observée que pour confirmer le chemin DMA ou TPG vers la sélection de source puis le PMOD VGA.</w:t>
+      </w:r>
+    </w:p>
+    <w:p>
+      <w:pPr>
+        <w:pStyle w:val="Normal"/>
+        <w:spacing w:before="0" w:after="100"/>
+        <w:rPr>
+          <w:rFonts w:eastAsia="Arial"/>
+          <w:b w:val="false"/>
+          <w:color w:val="000000"/>
+          <w:sz w:val="20"/>
+        </w:rPr>
+      </w:pPr>
+      <w:r>
+        <w:rPr>
+          <w:rFonts w:eastAsia="Arial"/>
+          <w:b w:val="false"/>
+          <w:color w:val="000000"/>
+          <w:sz w:val="20"/>
+        </w:rPr>
+        <w:drawing>
+          <wp:anchor distT="0" distB="0" distL="0" distR="0" simplePos="0" relativeHeight="2" behindDoc="0" locked="0" layoutInCell="0" allowOverlap="1">
+            <wp:simplePos x="0" y="0"/>
+            <wp:positionH relativeFrom="column">
+              <wp:align>center</wp:align>
+            </wp:positionH>
+            <wp:positionV relativeFrom="paragraph">
+              <wp:posOffset>635</wp:posOffset>
+            </wp:positionV>
+            <wp:extent cx="6170930" cy="3275330"/>
+            <wp:effectExtent l="0" t="0" r="0" b="0"/>
+            <wp:wrapSquare wrapText="largest"/>
+            <wp:docPr id="1" name="Image1"/>
+            <wp:cNvGraphicFramePr>
+              <a:graphicFrameLocks xmlns:a="http://schemas.openxmlformats.org/drawingml/2006/main" noChangeAspect="1"/>
+            </wp:cNvGraphicFramePr>
+            <a:graphic xmlns:a="http://schemas.openxmlformats.org/drawingml/2006/main">
+              <a:graphicData uri="http://schemas.openxmlformats.org/drawingml/2006/picture">
+                <pic:pic xmlns:pic="http://schemas.openxmlformats.org/drawingml/2006/picture">
+                  <pic:nvPicPr>
+                    <pic:cNvPr id="1" name="Image1"/>
+                    <pic:cNvPicPr>
+                      <a:picLocks noChangeAspect="1" noChangeArrowheads="1"/>
+                    </pic:cNvPicPr>
+                  </pic:nvPicPr>
+                  <pic:blipFill>
+                    <a:blip r:embed="rId2"/>
+                    <a:stretch>
+                      <a:fillRect/>
+                    </a:stretch>
+                  </pic:blipFill>
+                  <pic:spPr bwMode="auto">
+                    <a:xfrm>
+                      <a:off x="0" y="0"/>
+                      <a:ext cx="6170930" cy="3275330"/>
+                    </a:xfrm>
+                    <a:prstGeom prst="rect">
+                      <a:avLst/>
+                    </a:prstGeom>
+                    <a:noFill/>
+                  </pic:spPr>
+                </pic:pic>
+              </a:graphicData>
+            </a:graphic>
+          </wp:anchor>
+        </w:drawing>
       </w:r>
     </w:p>
     <w:p>
@@ -1448,6 +1464,340 @@
       </w:pPr>
       <w:r>
         <w:rPr/>
+        <w:t>3.3 Affichage PMOD VGA</w:t>
+      </w:r>
+    </w:p>
+    <w:p>
+      <w:pPr>
+        <w:pStyle w:val="Heading3"/>
+        <w:rPr/>
+      </w:pPr>
+      <w:r>
+        <w:rPr/>
+        <w:t>VP-VGA-01 - Mode vidéo et sortie physique  |  Priorité P1</w:t>
+      </w:r>
+    </w:p>
+    <w:p>
+      <w:pPr>
+        <w:pStyle w:val="Normal"/>
+        <w:spacing w:before="0" w:after="80"/>
+        <w:ind w:hanging="173" w:start="173"/>
+        <w:rPr/>
+      </w:pPr>
+      <w:r>
+        <w:rPr>
+          <w:rFonts w:eastAsia="Arial"/>
+          <w:b/>
+          <w:color w:val="000000"/>
+          <w:sz w:val="19"/>
+        </w:rPr>
+        <w:t xml:space="preserve">Objectif : </w:t>
+      </w:r>
+      <w:r>
+        <w:rPr>
+          <w:rFonts w:eastAsia="Arial"/>
+          <w:b w:val="false"/>
+          <w:color w:val="000000"/>
+          <w:sz w:val="19"/>
+        </w:rPr>
+        <w:t>Vérifier la synchronisation et l’affichage sur un écran compatible via le PMOD VGA.</w:t>
+      </w:r>
+    </w:p>
+    <w:p>
+      <w:pPr>
+        <w:pStyle w:val="Normal"/>
+        <w:spacing w:before="0" w:after="80"/>
+        <w:ind w:hanging="173" w:start="173"/>
+        <w:rPr/>
+      </w:pPr>
+      <w:r>
+        <w:rPr>
+          <w:rFonts w:eastAsia="Arial"/>
+          <w:b/>
+          <w:color w:val="000000"/>
+          <w:sz w:val="19"/>
+        </w:rPr>
+        <w:t xml:space="preserve">Exécution : </w:t>
+      </w:r>
+      <w:r>
+        <w:rPr>
+          <w:rFonts w:eastAsia="Arial"/>
+          <w:b w:val="false"/>
+          <w:color w:val="000000"/>
+          <w:sz w:val="19"/>
+        </w:rPr>
+        <w:t>Programmer le bitstream; raccorder le PMOD VGA et l’écran; afficher le flux de référence ou l</w:t>
+      </w:r>
+      <w:r>
+        <w:rPr>
+          <w:rFonts w:eastAsia="Arial"/>
+          <w:b w:val="false"/>
+          <w:color w:val="000000"/>
+          <w:sz w:val="19"/>
+        </w:rPr>
+        <w:t>e</w:t>
+      </w:r>
+      <w:r>
+        <w:rPr>
+          <w:rFonts w:eastAsia="Arial"/>
+          <w:b w:val="false"/>
+          <w:color w:val="000000"/>
+          <w:sz w:val="19"/>
+        </w:rPr>
+        <w:t xml:space="preserve"> </w:t>
+      </w:r>
+      <w:r>
+        <w:rPr>
+          <w:rFonts w:eastAsia="Arial"/>
+          <w:b w:val="false"/>
+          <w:color w:val="000000"/>
+          <w:sz w:val="19"/>
+        </w:rPr>
+        <w:t>flux</w:t>
+      </w:r>
+      <w:r>
+        <w:rPr>
+          <w:rFonts w:eastAsia="Arial"/>
+          <w:b w:val="false"/>
+          <w:color w:val="000000"/>
+          <w:sz w:val="19"/>
+        </w:rPr>
+        <w:t xml:space="preserve"> TPG; mesurer les synchronisations horizontale et verticale ainsi que la cadence, puis vérifier la zone active et les couleurs.</w:t>
+      </w:r>
+    </w:p>
+    <w:p>
+      <w:pPr>
+        <w:pStyle w:val="Normal"/>
+        <w:spacing w:before="0" w:after="80"/>
+        <w:ind w:hanging="173" w:start="173"/>
+        <w:rPr/>
+      </w:pPr>
+      <w:r>
+        <w:rPr>
+          <w:rFonts w:eastAsia="Arial"/>
+          <w:b/>
+          <w:color w:val="000000"/>
+          <w:sz w:val="19"/>
+        </w:rPr>
+        <w:t xml:space="preserve">Acceptation : </w:t>
+      </w:r>
+      <w:r>
+        <w:rPr>
+          <w:rFonts w:eastAsia="Arial"/>
+          <w:b w:val="false"/>
+          <w:color w:val="000000"/>
+          <w:sz w:val="19"/>
+        </w:rPr>
+        <w:t>L’écran se verrouille sur 640 × 480 à 60 Hz; l’image attendue est visible dans la zone active, avec des couleurs cohérentes et sans perte persistante de synchronisation.</w:t>
+      </w:r>
+    </w:p>
+    <w:p>
+      <w:pPr>
+        <w:pStyle w:val="Heading2"/>
+        <w:rPr/>
+      </w:pPr>
+      <w:r>
+        <w:rPr>
+          <w:rFonts w:eastAsia="Arial"/>
+          <w:b/>
+          <w:color w:val="000000"/>
+          <w:sz w:val="19"/>
+        </w:rPr>
+        <w:t xml:space="preserve">Preuve à conserver : </w:t>
+      </w:r>
+      <w:r>
+        <w:rPr>
+          <w:rFonts w:eastAsia="Arial"/>
+          <w:b w:val="false"/>
+          <w:color w:val="000000"/>
+          <w:sz w:val="19"/>
+        </w:rPr>
+        <w:t>Photo ou capture de l’écran, mesures de synchronisation/cadence, référence de l’écran, brochage utilisé et bitstream.</w:t>
+      </w:r>
+    </w:p>
+    <w:p>
+      <w:pPr>
+        <w:pStyle w:val="Heading2"/>
+        <w:rPr/>
+      </w:pPr>
+      <w:r>
+        <w:rPr/>
+        <w:t>3.2 Générateur d’</w:t>
+      </w:r>
+      <w:r>
+        <w:rPr/>
+        <w:t>image</w:t>
+      </w:r>
+      <w:r>
+        <w:rPr/>
+        <w:t xml:space="preserve"> TPG</w:t>
+      </w:r>
+    </w:p>
+    <w:p>
+      <w:pPr>
+        <w:pStyle w:val="Heading3"/>
+        <w:rPr/>
+      </w:pPr>
+      <w:r>
+        <w:rPr/>
+        <w:t xml:space="preserve">VP-TPG-01 - </w:t>
+      </w:r>
+      <w:r>
+        <w:rPr/>
+        <w:t>Image</w:t>
+      </w:r>
+      <w:r>
+        <w:rPr/>
+        <w:t xml:space="preserve"> et mouvement  |  Priorité P1</w:t>
+      </w:r>
+    </w:p>
+    <w:p>
+      <w:pPr>
+        <w:pStyle w:val="Normal"/>
+        <w:spacing w:before="0" w:after="80"/>
+        <w:ind w:hanging="173" w:start="173"/>
+        <w:rPr/>
+      </w:pPr>
+      <w:r>
+        <w:rPr>
+          <w:rFonts w:eastAsia="Arial"/>
+          <w:b/>
+          <w:color w:val="000000"/>
+          <w:sz w:val="19"/>
+        </w:rPr>
+        <w:t xml:space="preserve">Objectif : </w:t>
+      </w:r>
+      <w:r>
+        <w:rPr>
+          <w:rFonts w:eastAsia="Arial"/>
+          <w:b w:val="false"/>
+          <w:color w:val="000000"/>
+          <w:sz w:val="19"/>
+        </w:rPr>
+        <w:t xml:space="preserve">Vérifier la présence d’un </w:t>
+      </w:r>
+      <w:r>
+        <w:rPr>
+          <w:rFonts w:eastAsia="Arial"/>
+          <w:b w:val="false"/>
+          <w:color w:val="000000"/>
+          <w:sz w:val="19"/>
+        </w:rPr>
+        <w:t>flux</w:t>
+      </w:r>
+      <w:r>
+        <w:rPr>
+          <w:rFonts w:eastAsia="Arial"/>
+          <w:b w:val="false"/>
+          <w:color w:val="000000"/>
+          <w:sz w:val="19"/>
+        </w:rPr>
+        <w:t xml:space="preserve"> et le déplacement d’au moins un élément dans le temps.</w:t>
+      </w:r>
+    </w:p>
+    <w:p>
+      <w:pPr>
+        <w:pStyle w:val="Normal"/>
+        <w:spacing w:before="0" w:after="80"/>
+        <w:ind w:hanging="173" w:start="173"/>
+        <w:rPr/>
+      </w:pPr>
+      <w:r>
+        <w:rPr>
+          <w:rFonts w:eastAsia="Arial"/>
+          <w:b/>
+          <w:color w:val="000000"/>
+          <w:sz w:val="19"/>
+        </w:rPr>
+        <w:t xml:space="preserve">Exécution : </w:t>
+      </w:r>
+      <w:r>
+        <w:rPr>
+          <w:rFonts w:eastAsia="Arial"/>
+          <w:b w:val="false"/>
+          <w:color w:val="000000"/>
+          <w:sz w:val="19"/>
+        </w:rPr>
+        <w:t>Démarrer le TPG; capturer au moins deux instants distincts ou deux trames; observer le flux et l’image affichée; vérifier les frontières de ligne et de trame utilisées par l’interface.</w:t>
+      </w:r>
+    </w:p>
+    <w:p>
+      <w:pPr>
+        <w:pStyle w:val="Normal"/>
+        <w:spacing w:before="0" w:after="80"/>
+        <w:ind w:hanging="173" w:start="173"/>
+        <w:rPr/>
+      </w:pPr>
+      <w:r>
+        <w:rPr>
+          <w:rFonts w:eastAsia="Arial"/>
+          <w:b/>
+          <w:color w:val="000000"/>
+          <w:sz w:val="19"/>
+        </w:rPr>
+        <w:t xml:space="preserve">Acceptation : </w:t>
+      </w:r>
+      <w:r>
+        <w:rPr>
+          <w:rFonts w:eastAsia="Arial"/>
+          <w:b w:val="false"/>
+          <w:color w:val="000000"/>
+          <w:sz w:val="19"/>
+        </w:rPr>
+        <w:t>L’</w:t>
+      </w:r>
+      <w:r>
+        <w:rPr>
+          <w:rFonts w:eastAsia="Arial"/>
+          <w:b w:val="false"/>
+          <w:color w:val="000000"/>
+          <w:sz w:val="19"/>
+        </w:rPr>
+        <w:t>image</w:t>
+      </w:r>
+      <w:r>
+        <w:rPr>
+          <w:rFonts w:eastAsia="Arial"/>
+          <w:b w:val="false"/>
+          <w:color w:val="000000"/>
+          <w:sz w:val="19"/>
+        </w:rPr>
+        <w:t xml:space="preserve"> est visible et un élément change de position au cours du temps; la sortie conserve des trames complètes et se raccorde au chemin vidéo prévu.</w:t>
+      </w:r>
+    </w:p>
+    <w:p>
+      <w:pPr>
+        <w:pStyle w:val="Normal"/>
+        <w:spacing w:before="0" w:after="80"/>
+        <w:ind w:hanging="173" w:start="173"/>
+        <w:rPr/>
+      </w:pPr>
+      <w:r>
+        <w:rPr>
+          <w:rFonts w:eastAsia="Arial"/>
+          <w:b/>
+          <w:color w:val="000000"/>
+          <w:sz w:val="19"/>
+        </w:rPr>
+        <w:t xml:space="preserve">Preuve à conserver : </w:t>
+      </w:r>
+      <w:r>
+        <w:rPr>
+          <w:rFonts w:eastAsia="Arial"/>
+          <w:b w:val="false"/>
+          <w:color w:val="000000"/>
+          <w:sz w:val="19"/>
+        </w:rPr>
+        <w:t>Captures datées ou trames de référence, configuration du TPG et traces du flux.</w:t>
+      </w:r>
+    </w:p>
+    <w:p>
+      <w:pPr>
+        <w:pStyle w:val="Heading2"/>
+        <w:rPr/>
+      </w:pPr>
+      <w:r>
+        <w:rPr/>
         <w:t>3.1 DMA MM2S</w:t>
       </w:r>
     </w:p>
@@ -1686,254 +2036,6 @@
       </w:pPr>
       <w:r>
         <w:rPr/>
-        <w:t>3.2 Générateur de mire TPG</w:t>
-      </w:r>
-    </w:p>
-    <w:p>
-      <w:pPr>
-        <w:pStyle w:val="Heading3"/>
-        <w:rPr/>
-      </w:pPr>
-      <w:r>
-        <w:rPr/>
-        <w:t>VP-TPG-01 - Mire et mouvement  |  Priorité P1</w:t>
-      </w:r>
-    </w:p>
-    <w:p>
-      <w:pPr>
-        <w:pStyle w:val="Normal"/>
-        <w:spacing w:before="0" w:after="80"/>
-        <w:ind w:hanging="173" w:start="173"/>
-        <w:rPr/>
-      </w:pPr>
-      <w:r>
-        <w:rPr>
-          <w:rFonts w:eastAsia="Arial"/>
-          <w:b/>
-          <w:color w:val="000000"/>
-          <w:sz w:val="19"/>
-        </w:rPr>
-        <w:t xml:space="preserve">Objectif : </w:t>
-      </w:r>
-      <w:r>
-        <w:rPr>
-          <w:rFonts w:eastAsia="Arial"/>
-          <w:b w:val="false"/>
-          <w:color w:val="000000"/>
-          <w:sz w:val="19"/>
-        </w:rPr>
-        <w:t>Vérifier la présence d’une mire et le déplacement d’au moins un élément dans le temps.</w:t>
-      </w:r>
-    </w:p>
-    <w:p>
-      <w:pPr>
-        <w:pStyle w:val="Normal"/>
-        <w:spacing w:before="0" w:after="80"/>
-        <w:ind w:hanging="173" w:start="173"/>
-        <w:rPr/>
-      </w:pPr>
-      <w:r>
-        <w:rPr>
-          <w:rFonts w:eastAsia="Arial"/>
-          <w:b/>
-          <w:color w:val="000000"/>
-          <w:sz w:val="19"/>
-        </w:rPr>
-        <w:t xml:space="preserve">Exécution : </w:t>
-      </w:r>
-      <w:r>
-        <w:rPr>
-          <w:rFonts w:eastAsia="Arial"/>
-          <w:b w:val="false"/>
-          <w:color w:val="000000"/>
-          <w:sz w:val="19"/>
-        </w:rPr>
-        <w:t>Démarrer le TPG; capturer au moins deux instants distincts ou deux trames; observer le flux et l’image affichée; vérifier les frontières de ligne et de trame utilisées par l’interface.</w:t>
-      </w:r>
-    </w:p>
-    <w:p>
-      <w:pPr>
-        <w:pStyle w:val="Normal"/>
-        <w:spacing w:before="0" w:after="80"/>
-        <w:ind w:hanging="173" w:start="173"/>
-        <w:rPr/>
-      </w:pPr>
-      <w:r>
-        <w:rPr>
-          <w:rFonts w:eastAsia="Arial"/>
-          <w:b/>
-          <w:color w:val="000000"/>
-          <w:sz w:val="19"/>
-        </w:rPr>
-        <w:t xml:space="preserve">Acceptation : </w:t>
-      </w:r>
-      <w:r>
-        <w:rPr>
-          <w:rFonts w:eastAsia="Arial"/>
-          <w:b w:val="false"/>
-          <w:color w:val="000000"/>
-          <w:sz w:val="19"/>
-        </w:rPr>
-        <w:t>La mire est visible et un élément change de position au cours du temps; la sortie conserve des trames complètes et se raccorde au chemin vidéo prévu.</w:t>
-      </w:r>
-    </w:p>
-    <w:p>
-      <w:pPr>
-        <w:pStyle w:val="Normal"/>
-        <w:spacing w:before="0" w:after="80"/>
-        <w:ind w:hanging="173" w:start="173"/>
-        <w:rPr/>
-      </w:pPr>
-      <w:r>
-        <w:rPr>
-          <w:rFonts w:eastAsia="Arial"/>
-          <w:b/>
-          <w:color w:val="000000"/>
-          <w:sz w:val="19"/>
-        </w:rPr>
-        <w:t xml:space="preserve">Preuve à conserver : </w:t>
-      </w:r>
-      <w:r>
-        <w:rPr>
-          <w:rFonts w:eastAsia="Arial"/>
-          <w:b w:val="false"/>
-          <w:color w:val="000000"/>
-          <w:sz w:val="19"/>
-        </w:rPr>
-        <w:t>Captures datées ou trames de référence, configuration du TPG et traces du flux.</w:t>
-      </w:r>
-    </w:p>
-    <w:p>
-      <w:pPr>
-        <w:pStyle w:val="Heading2"/>
-        <w:rPr/>
-      </w:pPr>
-      <w:r>
-        <w:rPr/>
-        <w:t>3.3 Affichage PMOD VGA</w:t>
-      </w:r>
-    </w:p>
-    <w:p>
-      <w:pPr>
-        <w:pStyle w:val="Heading3"/>
-        <w:rPr/>
-      </w:pPr>
-      <w:r>
-        <w:rPr/>
-        <w:t>VP-VGA-01 - Mode vidéo et sortie physique  |  Priorité P1</w:t>
-      </w:r>
-    </w:p>
-    <w:p>
-      <w:pPr>
-        <w:pStyle w:val="Normal"/>
-        <w:spacing w:before="0" w:after="80"/>
-        <w:ind w:hanging="173" w:start="173"/>
-        <w:rPr/>
-      </w:pPr>
-      <w:r>
-        <w:rPr>
-          <w:rFonts w:eastAsia="Arial"/>
-          <w:b/>
-          <w:color w:val="000000"/>
-          <w:sz w:val="19"/>
-        </w:rPr>
-        <w:t xml:space="preserve">Objectif : </w:t>
-      </w:r>
-      <w:r>
-        <w:rPr>
-          <w:rFonts w:eastAsia="Arial"/>
-          <w:b w:val="false"/>
-          <w:color w:val="000000"/>
-          <w:sz w:val="19"/>
-        </w:rPr>
-        <w:t>Vérifier la synchronisation et l’affichage sur un écran compatible via le PMOD VGA.</w:t>
-      </w:r>
-    </w:p>
-    <w:p>
-      <w:pPr>
-        <w:pStyle w:val="Normal"/>
-        <w:spacing w:before="0" w:after="80"/>
-        <w:ind w:hanging="173" w:start="173"/>
-        <w:rPr/>
-      </w:pPr>
-      <w:r>
-        <w:rPr>
-          <w:rFonts w:eastAsia="Arial"/>
-          <w:b/>
-          <w:color w:val="000000"/>
-          <w:sz w:val="19"/>
-        </w:rPr>
-        <w:t xml:space="preserve">Exécution : </w:t>
-      </w:r>
-      <w:r>
-        <w:rPr>
-          <w:rFonts w:eastAsia="Arial"/>
-          <w:b w:val="false"/>
-          <w:color w:val="000000"/>
-          <w:sz w:val="19"/>
-        </w:rPr>
-        <w:t>Programmer le bitstream; raccorder le PMOD VGA et l’écran; afficher le flux de référence ou la mire TPG; mesurer les synchronisations horizontale et verticale ainsi que la cadence, puis vérifier la zone active et les couleurs.</w:t>
-      </w:r>
-    </w:p>
-    <w:p>
-      <w:pPr>
-        <w:pStyle w:val="Normal"/>
-        <w:spacing w:before="0" w:after="80"/>
-        <w:ind w:hanging="173" w:start="173"/>
-        <w:rPr/>
-      </w:pPr>
-      <w:r>
-        <w:rPr>
-          <w:rFonts w:eastAsia="Arial"/>
-          <w:b/>
-          <w:color w:val="000000"/>
-          <w:sz w:val="19"/>
-        </w:rPr>
-        <w:t xml:space="preserve">Acceptation : </w:t>
-      </w:r>
-      <w:r>
-        <w:rPr>
-          <w:rFonts w:eastAsia="Arial"/>
-          <w:b w:val="false"/>
-          <w:color w:val="000000"/>
-          <w:sz w:val="19"/>
-        </w:rPr>
-        <w:t>L’écran se verrouille sur 640 × 480 à 60 Hz; l’image attendue est visible dans la zone active, avec des couleurs cohérentes et sans perte persistante de synchronisation.</w:t>
-      </w:r>
-    </w:p>
-    <w:p>
-      <w:pPr>
-        <w:pStyle w:val="Normal"/>
-        <w:spacing w:before="0" w:after="80"/>
-        <w:ind w:hanging="173" w:start="173"/>
-        <w:rPr/>
-      </w:pPr>
-      <w:r>
-        <w:rPr>
-          <w:rFonts w:eastAsia="Arial"/>
-          <w:b/>
-          <w:color w:val="000000"/>
-          <w:sz w:val="19"/>
-        </w:rPr>
-        <w:t xml:space="preserve">Preuve à conserver : </w:t>
-      </w:r>
-      <w:r>
-        <w:rPr>
-          <w:rFonts w:eastAsia="Arial"/>
-          <w:b w:val="false"/>
-          <w:color w:val="000000"/>
-          <w:sz w:val="19"/>
-        </w:rPr>
-        <w:t>Photo ou capture de l’écran, mesures de synchronisation/cadence, référence de l’écran, brochage utilisé et bitstream.</w:t>
-      </w:r>
-    </w:p>
-    <w:p>
-      <w:pPr>
-        <w:pStyle w:val="Heading2"/>
-        <w:rPr/>
-      </w:pPr>
-      <w:r>
-        <w:rPr/>
         <w:t>3.4 Sélection de source</w:t>
       </w:r>
     </w:p>
@@ -2053,120 +2155,6 @@
     </w:p>
     <w:p>
       <w:pPr>
-        <w:pStyle w:val="Heading3"/>
-        <w:rPr/>
-      </w:pPr>
-      <w:r>
-        <w:rPr/>
-        <w:t>VP-SRC-02 - Changement à chaud  |  Priorité P2 - complémentaire</w:t>
-      </w:r>
-    </w:p>
-    <w:p>
-      <w:pPr>
-        <w:pStyle w:val="Normal"/>
-        <w:spacing w:before="0" w:after="80"/>
-        <w:ind w:hanging="173" w:start="173"/>
-        <w:rPr/>
-      </w:pPr>
-      <w:r>
-        <w:rPr>
-          <w:rFonts w:eastAsia="Arial"/>
-          <w:b/>
-          <w:color w:val="000000"/>
-          <w:sz w:val="19"/>
-        </w:rPr>
-        <w:t xml:space="preserve">Objectif : </w:t>
-      </w:r>
-      <w:r>
-        <w:rPr>
-          <w:rFonts w:eastAsia="Arial"/>
-          <w:b w:val="false"/>
-          <w:color w:val="000000"/>
-          <w:sz w:val="19"/>
-        </w:rPr>
-        <w:t>Vérifier le changement de DMA vers TPG et de TPG vers DMA pendant le fonctionnement.</w:t>
-      </w:r>
-    </w:p>
-    <w:p>
-      <w:pPr>
-        <w:pStyle w:val="Normal"/>
-        <w:spacing w:before="0" w:after="80"/>
-        <w:ind w:hanging="173" w:start="173"/>
-        <w:rPr/>
-      </w:pPr>
-      <w:r>
-        <w:rPr>
-          <w:rFonts w:eastAsia="Arial"/>
-          <w:b/>
-          <w:color w:val="000000"/>
-          <w:sz w:val="19"/>
-        </w:rPr>
-        <w:t xml:space="preserve">Exécution : </w:t>
-      </w:r>
-      <w:r>
-        <w:rPr>
-          <w:rFonts w:eastAsia="Arial"/>
-          <w:b w:val="false"/>
-          <w:color w:val="000000"/>
-          <w:sz w:val="19"/>
-        </w:rPr>
-        <w:t>Laisser le système actif; écrire successivement les sélections par le registre PS; observer le flux avant, pendant et après chaque écriture; documenter le comportement à la transition.</w:t>
-      </w:r>
-    </w:p>
-    <w:p>
-      <w:pPr>
-        <w:pStyle w:val="Normal"/>
-        <w:spacing w:before="0" w:after="80"/>
-        <w:ind w:hanging="173" w:start="173"/>
-        <w:rPr/>
-      </w:pPr>
-      <w:r>
-        <w:rPr>
-          <w:rFonts w:eastAsia="Arial"/>
-          <w:b/>
-          <w:color w:val="000000"/>
-          <w:sz w:val="19"/>
-        </w:rPr>
-        <w:t xml:space="preserve">Acceptation : </w:t>
-      </w:r>
-      <w:r>
-        <w:rPr>
-          <w:rFonts w:eastAsia="Arial"/>
-          <w:b w:val="false"/>
-          <w:color w:val="000000"/>
-          <w:sz w:val="19"/>
-        </w:rPr>
-        <w:t>Après chaque écriture, la source demandée devient la source affichée sans blocage durable du flux. Noter les éventuels artefacts transitoires et la règle de bascule appliquée.</w:t>
-      </w:r>
-    </w:p>
-    <w:p>
-      <w:pPr>
-        <w:pStyle w:val="Normal"/>
-        <w:spacing w:before="0" w:after="80"/>
-        <w:ind w:hanging="173" w:start="173"/>
-        <w:rPr/>
-      </w:pPr>
-      <w:r>
-        <w:rPr>
-          <w:rFonts w:eastAsia="Arial"/>
-          <w:b/>
-          <w:color w:val="000000"/>
-          <w:sz w:val="19"/>
-        </w:rPr>
-        <w:t xml:space="preserve">Preuve à conserver : </w:t>
-      </w:r>
-      <w:r>
-        <w:rPr>
-          <w:rFonts w:eastAsia="Arial"/>
-          <w:b w:val="false"/>
-          <w:color w:val="000000"/>
-          <w:sz w:val="19"/>
-        </w:rPr>
-        <w:t>Valeurs écrites/lues, chronologie de capture, trames avant/après et journal PS.</w:t>
-      </w:r>
-    </w:p>
-    <w:p>
-      <w:pPr>
         <w:pStyle w:val="Heading1"/>
         <w:rPr/>
       </w:pPr>
@@ -2204,7 +2192,7 @@
           <w:color w:val="000000"/>
           <w:sz w:val="20"/>
         </w:rPr>
-        <w:t>La validation P1 est acquise lorsque VP-DMA-01, VP-DMA-02, VP-TPG-01, VP-VGA-01 et VP-SRC-01 sont réussis et qu’aucun écart bloquant ne subsiste. VP-SRC-02, de priorité P2 dans le SRS, est consigné séparément comme complémentaire.</w:t>
+        <w:t>La validation P1 est acquise lorsque VP-DMA-01, VP-DMA-02, VP-TPG-01, VP-VGA-01 et VP-SRC-01 sont réussis et qu’aucun écart bloquant ne subsiste.</w:t>
       </w:r>
     </w:p>
     <w:p>
@@ -2224,9 +2212,9 @@
       </w:r>
     </w:p>
     <w:sectPr>
-      <w:footerReference w:type="even" r:id="rId2"/>
-      <w:footerReference w:type="default" r:id="rId3"/>
-      <w:footerReference w:type="first" r:id="rId4"/>
+      <w:footerReference w:type="even" r:id="rId3"/>
+      <w:footerReference w:type="default" r:id="rId4"/>
+      <w:footerReference w:type="first" r:id="rId5"/>
       <w:type w:val="nextPage"/>
       <w:pgSz w:w="11906" w:h="16838"/>
       <w:pgMar w:left="1094" w:right="1094" w:gutter="0" w:header="0" w:top="1037" w:footer="490" w:bottom="979"/>
@@ -2376,6 +2364,7 @@
         </w:tabs>
         <w:ind w:start="1080" w:hanging="360"/>
       </w:pPr>
+      <w:rPr/>
     </w:lvl>
     <w:lvl w:ilvl="2">
       <w:start w:val="1"/>
@@ -2388,6 +2377,7 @@
         </w:tabs>
         <w:ind w:start="1440" w:hanging="360"/>
       </w:pPr>
+      <w:rPr/>
     </w:lvl>
     <w:lvl w:ilvl="3">
       <w:start w:val="1"/>
@@ -2400,6 +2390,7 @@
         </w:tabs>
         <w:ind w:start="1800" w:hanging="360"/>
       </w:pPr>
+      <w:rPr/>
     </w:lvl>
     <w:lvl w:ilvl="4">
       <w:start w:val="1"/>
@@ -2412,6 +2403,7 @@
         </w:tabs>
         <w:ind w:start="2160" w:hanging="360"/>
       </w:pPr>
+      <w:rPr/>
     </w:lvl>
     <w:lvl w:ilvl="5">
       <w:start w:val="1"/>
@@ -2424,6 +2416,7 @@
         </w:tabs>
         <w:ind w:start="2520" w:hanging="360"/>
       </w:pPr>
+      <w:rPr/>
     </w:lvl>
     <w:lvl w:ilvl="6">
       <w:start w:val="1"/>
@@ -2436,6 +2429,7 @@
         </w:tabs>
         <w:ind w:start="2880" w:hanging="360"/>
       </w:pPr>
+      <w:rPr/>
     </w:lvl>
     <w:lvl w:ilvl="7">
       <w:start w:val="1"/>
@@ -2448,6 +2442,7 @@
         </w:tabs>
         <w:ind w:start="3240" w:hanging="360"/>
       </w:pPr>
+      <w:rPr/>
     </w:lvl>
     <w:lvl w:ilvl="8">
       <w:start w:val="1"/>
@@ -2460,6 +2455,7 @@
         </w:tabs>
         <w:ind w:start="3600" w:hanging="360"/>
       </w:pPr>
+      <w:rPr/>
     </w:lvl>
   </w:abstractNum>
   <w:abstractNum w:abstractNumId="2">
@@ -2489,6 +2485,7 @@
         </w:tabs>
         <w:ind w:start="1080" w:hanging="360"/>
       </w:pPr>
+      <w:rPr/>
     </w:lvl>
     <w:lvl w:ilvl="2">
       <w:start w:val="1"/>
@@ -2501,6 +2498,7 @@
         </w:tabs>
         <w:ind w:start="1440" w:hanging="360"/>
       </w:pPr>
+      <w:rPr/>
     </w:lvl>
     <w:lvl w:ilvl="3">
       <w:start w:val="1"/>
@@ -2513,6 +2511,7 @@
         </w:tabs>
         <w:ind w:start="1800" w:hanging="360"/>
       </w:pPr>
+      <w:rPr/>
     </w:lvl>
     <w:lvl w:ilvl="4">
       <w:start w:val="1"/>
@@ -2525,6 +2524,7 @@
         </w:tabs>
         <w:ind w:start="2160" w:hanging="360"/>
       </w:pPr>
+      <w:rPr/>
     </w:lvl>
     <w:lvl w:ilvl="5">
       <w:start w:val="1"/>
@@ -2537,6 +2537,7 @@
         </w:tabs>
         <w:ind w:start="2520" w:hanging="360"/>
       </w:pPr>
+      <w:rPr/>
     </w:lvl>
     <w:lvl w:ilvl="6">
       <w:start w:val="1"/>
@@ -2549,6 +2550,7 @@
         </w:tabs>
         <w:ind w:start="2880" w:hanging="360"/>
       </w:pPr>
+      <w:rPr/>
     </w:lvl>
     <w:lvl w:ilvl="7">
       <w:start w:val="1"/>
@@ -2561,6 +2563,7 @@
         </w:tabs>
         <w:ind w:start="3240" w:hanging="360"/>
       </w:pPr>
+      <w:rPr/>
     </w:lvl>
     <w:lvl w:ilvl="8">
       <w:start w:val="1"/>
@@ -2573,6 +2576,7 @@
         </w:tabs>
         <w:ind w:start="3600" w:hanging="360"/>
       </w:pPr>
+      <w:rPr/>
     </w:lvl>
   </w:abstractNum>
   <w:abstractNum w:abstractNumId="3">
@@ -2602,6 +2606,7 @@
         </w:tabs>
         <w:ind w:start="1080" w:hanging="360"/>
       </w:pPr>
+      <w:rPr/>
     </w:lvl>
     <w:lvl w:ilvl="2">
       <w:start w:val="1"/>
@@ -2614,6 +2619,7 @@
         </w:tabs>
         <w:ind w:start="1440" w:hanging="360"/>
       </w:pPr>
+      <w:rPr/>
     </w:lvl>
     <w:lvl w:ilvl="3">
       <w:start w:val="1"/>
@@ -2626,6 +2632,7 @@
         </w:tabs>
         <w:ind w:start="1800" w:hanging="360"/>
       </w:pPr>
+      <w:rPr/>
     </w:lvl>
     <w:lvl w:ilvl="4">
       <w:start w:val="1"/>
@@ -2638,6 +2645,7 @@
         </w:tabs>
         <w:ind w:start="2160" w:hanging="360"/>
       </w:pPr>
+      <w:rPr/>
     </w:lvl>
     <w:lvl w:ilvl="5">
       <w:start w:val="1"/>
@@ -2650,6 +2658,7 @@
         </w:tabs>
         <w:ind w:start="2520" w:hanging="360"/>
       </w:pPr>
+      <w:rPr/>
     </w:lvl>
     <w:lvl w:ilvl="6">
       <w:start w:val="1"/>
@@ -2662,6 +2671,7 @@
         </w:tabs>
         <w:ind w:start="2880" w:hanging="360"/>
       </w:pPr>
+      <w:rPr/>
     </w:lvl>
     <w:lvl w:ilvl="7">
       <w:start w:val="1"/>
@@ -2674,6 +2684,7 @@
         </w:tabs>
         <w:ind w:start="3240" w:hanging="360"/>
       </w:pPr>
+      <w:rPr/>
     </w:lvl>
     <w:lvl w:ilvl="8">
       <w:start w:val="1"/>
@@ -2686,6 +2697,7 @@
         </w:tabs>
         <w:ind w:start="3600" w:hanging="360"/>
       </w:pPr>
+      <w:rPr/>
     </w:lvl>
   </w:abstractNum>
   <w:abstractNum w:abstractNumId="4">
@@ -2713,6 +2725,7 @@
         </w:tabs>
         <w:ind w:start="1080" w:hanging="360"/>
       </w:pPr>
+      <w:rPr/>
     </w:lvl>
     <w:lvl w:ilvl="2">
       <w:start w:val="1"/>
@@ -2725,6 +2738,7 @@
         </w:tabs>
         <w:ind w:start="1440" w:hanging="360"/>
       </w:pPr>
+      <w:rPr/>
     </w:lvl>
     <w:lvl w:ilvl="3">
       <w:start w:val="1"/>
@@ -2737,6 +2751,7 @@
         </w:tabs>
         <w:ind w:start="1800" w:hanging="360"/>
       </w:pPr>
+      <w:rPr/>
     </w:lvl>
     <w:lvl w:ilvl="4">
       <w:start w:val="1"/>
@@ -2749,6 +2764,7 @@
         </w:tabs>
         <w:ind w:start="2160" w:hanging="360"/>
       </w:pPr>
+      <w:rPr/>
     </w:lvl>
     <w:lvl w:ilvl="5">
       <w:start w:val="1"/>
@@ -2761,6 +2777,7 @@
         </w:tabs>
         <w:ind w:start="2520" w:hanging="360"/>
       </w:pPr>
+      <w:rPr/>
     </w:lvl>
     <w:lvl w:ilvl="6">
       <w:start w:val="1"/>
@@ -2773,6 +2790,7 @@
         </w:tabs>
         <w:ind w:start="2880" w:hanging="360"/>
       </w:pPr>
+      <w:rPr/>
     </w:lvl>
     <w:lvl w:ilvl="7">
       <w:start w:val="1"/>
@@ -2785,6 +2803,7 @@
         </w:tabs>
         <w:ind w:start="3240" w:hanging="360"/>
       </w:pPr>
+      <w:rPr/>
     </w:lvl>
     <w:lvl w:ilvl="8">
       <w:start w:val="1"/>
@@ -2797,6 +2816,7 @@
         </w:tabs>
         <w:ind w:start="3600" w:hanging="360"/>
       </w:pPr>
+      <w:rPr/>
     </w:lvl>
   </w:abstractNum>
   <w:abstractNum w:abstractNumId="5">
@@ -2824,6 +2844,7 @@
         </w:tabs>
         <w:ind w:start="1080" w:hanging="360"/>
       </w:pPr>
+      <w:rPr/>
     </w:lvl>
     <w:lvl w:ilvl="2">
       <w:start w:val="1"/>
@@ -2836,6 +2857,7 @@
         </w:tabs>
         <w:ind w:start="1440" w:hanging="360"/>
       </w:pPr>
+      <w:rPr/>
     </w:lvl>
     <w:lvl w:ilvl="3">
       <w:start w:val="1"/>
@@ -2848,6 +2870,7 @@
         </w:tabs>
         <w:ind w:start="1800" w:hanging="360"/>
       </w:pPr>
+      <w:rPr/>
     </w:lvl>
     <w:lvl w:ilvl="4">
       <w:start w:val="1"/>
@@ -2860,6 +2883,7 @@
         </w:tabs>
         <w:ind w:start="2160" w:hanging="360"/>
       </w:pPr>
+      <w:rPr/>
     </w:lvl>
     <w:lvl w:ilvl="5">
       <w:start w:val="1"/>
@@ -2872,6 +2896,7 @@
         </w:tabs>
         <w:ind w:start="2520" w:hanging="360"/>
       </w:pPr>
+      <w:rPr/>
     </w:lvl>
     <w:lvl w:ilvl="6">
       <w:start w:val="1"/>
@@ -2884,6 +2909,7 @@
         </w:tabs>
         <w:ind w:start="2880" w:hanging="360"/>
       </w:pPr>
+      <w:rPr/>
     </w:lvl>
     <w:lvl w:ilvl="7">
       <w:start w:val="1"/>
@@ -2896,6 +2922,7 @@
         </w:tabs>
         <w:ind w:start="3240" w:hanging="360"/>
       </w:pPr>
+      <w:rPr/>
     </w:lvl>
     <w:lvl w:ilvl="8">
       <w:start w:val="1"/>
@@ -2908,6 +2935,7 @@
         </w:tabs>
         <w:ind w:start="3600" w:hanging="360"/>
       </w:pPr>
+      <w:rPr/>
     </w:lvl>
   </w:abstractNum>
   <w:abstractNum w:abstractNumId="6">
@@ -2935,6 +2963,7 @@
         </w:tabs>
         <w:ind w:start="1080" w:hanging="360"/>
       </w:pPr>
+      <w:rPr/>
     </w:lvl>
     <w:lvl w:ilvl="2">
       <w:start w:val="1"/>
@@ -2947,6 +2976,7 @@
         </w:tabs>
         <w:ind w:start="1440" w:hanging="360"/>
       </w:pPr>
+      <w:rPr/>
     </w:lvl>
     <w:lvl w:ilvl="3">
       <w:start w:val="1"/>
@@ -2959,6 +2989,7 @@
         </w:tabs>
         <w:ind w:start="1800" w:hanging="360"/>
       </w:pPr>
+      <w:rPr/>
     </w:lvl>
     <w:lvl w:ilvl="4">
       <w:start w:val="1"/>
@@ -2971,6 +3002,7 @@
         </w:tabs>
         <w:ind w:start="2160" w:hanging="360"/>
       </w:pPr>
+      <w:rPr/>
     </w:lvl>
     <w:lvl w:ilvl="5">
       <w:start w:val="1"/>
@@ -2983,6 +3015,7 @@
         </w:tabs>
         <w:ind w:start="2520" w:hanging="360"/>
       </w:pPr>
+      <w:rPr/>
     </w:lvl>
     <w:lvl w:ilvl="6">
       <w:start w:val="1"/>
@@ -2995,6 +3028,7 @@
         </w:tabs>
         <w:ind w:start="2880" w:hanging="360"/>
       </w:pPr>
+      <w:rPr/>
     </w:lvl>
     <w:lvl w:ilvl="7">
       <w:start w:val="1"/>
@@ -3007,6 +3041,7 @@
         </w:tabs>
         <w:ind w:start="3240" w:hanging="360"/>
       </w:pPr>
+      <w:rPr/>
     </w:lvl>
     <w:lvl w:ilvl="8">
       <w:start w:val="1"/>
@@ -3019,6 +3054,7 @@
         </w:tabs>
         <w:ind w:start="3600" w:hanging="360"/>
       </w:pPr>
+      <w:rPr/>
     </w:lvl>
   </w:abstractNum>
   <w:abstractNum w:abstractNumId="7">
@@ -3169,7 +3205,7 @@
   <w:docDefaults>
     <w:rPrDefault>
       <w:rPr>
-        <w:rFonts w:ascii="Cambria" w:hAnsi="Cambria" w:eastAsia="ＭＳ 明朝" w:cs="" w:asciiTheme="minorHAnsi" w:cstheme="minorBidi" w:eastAsiaTheme="minorEastAsia" w:hAnsiTheme="minorHAnsi"/>
+        <w:rFonts w:ascii="Cambria" w:hAnsi="Cambria" w:eastAsia="" w:cs="" w:asciiTheme="minorHAnsi" w:cstheme="minorBidi" w:eastAsiaTheme="minorEastAsia" w:hAnsiTheme="minorHAnsi"/>
         <w:sz w:val="22"/>
         <w:szCs w:val="22"/>
         <w:lang w:val="en-US" w:eastAsia="en-US" w:bidi="ar-SA"/>
@@ -3326,6 +3362,7 @@
     <w:rsid w:val="00fc693f"/>
     <w:pPr>
       <w:widowControl/>
+      <w:suppressAutoHyphens w:val="true"/>
       <w:bidi w:val="0"/>
       <w:spacing w:lineRule="auto" w:line="259" w:before="0" w:after="100"/>
       <w:jc w:val="start"/>
@@ -3354,7 +3391,7 @@
       <w:outlineLvl w:val="0"/>
     </w:pPr>
     <w:rPr>
-      <w:rFonts w:ascii="Calibri" w:hAnsi="Calibri" w:eastAsia="ＭＳ ゴシック" w:cs="" w:asciiTheme="majorHAnsi" w:cstheme="majorBidi" w:eastAsiaTheme="majorEastAsia" w:hAnsiTheme="majorHAnsi"/>
+      <w:rFonts w:ascii="Calibri" w:hAnsi="Calibri" w:eastAsia="" w:cs="" w:asciiTheme="majorHAnsi" w:cstheme="majorBidi" w:eastAsiaTheme="majorEastAsia" w:hAnsiTheme="majorHAnsi"/>
       <w:b/>
       <w:bCs/>
       <w:color w:val="000000"/>
@@ -3378,7 +3415,7 @@
       <w:outlineLvl w:val="1"/>
     </w:pPr>
     <w:rPr>
-      <w:rFonts w:ascii="Calibri" w:hAnsi="Calibri" w:eastAsia="ＭＳ ゴシック" w:cs="" w:asciiTheme="majorHAnsi" w:cstheme="majorBidi" w:eastAsiaTheme="majorEastAsia" w:hAnsiTheme="majorHAnsi"/>
+      <w:rFonts w:ascii="Calibri" w:hAnsi="Calibri" w:eastAsia="" w:cs="" w:asciiTheme="majorHAnsi" w:cstheme="majorBidi" w:eastAsiaTheme="majorEastAsia" w:hAnsiTheme="majorHAnsi"/>
       <w:b/>
       <w:bCs/>
       <w:color w:val="000000"/>
@@ -3402,7 +3439,7 @@
       <w:outlineLvl w:val="2"/>
     </w:pPr>
     <w:rPr>
-      <w:rFonts w:ascii="Calibri" w:hAnsi="Calibri" w:eastAsia="ＭＳ ゴシック" w:cs="" w:asciiTheme="majorHAnsi" w:cstheme="majorBidi" w:eastAsiaTheme="majorEastAsia" w:hAnsiTheme="majorHAnsi"/>
+      <w:rFonts w:ascii="Calibri" w:hAnsi="Calibri" w:eastAsia="" w:cs="" w:asciiTheme="majorHAnsi" w:cstheme="majorBidi" w:eastAsiaTheme="majorEastAsia" w:hAnsiTheme="majorHAnsi"/>
       <w:b/>
       <w:bCs/>
       <w:color w:val="000000"/>
@@ -3426,7 +3463,7 @@
       <w:outlineLvl w:val="3"/>
     </w:pPr>
     <w:rPr>
-      <w:rFonts w:ascii="Calibri" w:hAnsi="Calibri" w:eastAsia="ＭＳ ゴシック" w:cs="" w:asciiTheme="majorHAnsi" w:cstheme="majorBidi" w:eastAsiaTheme="majorEastAsia" w:hAnsiTheme="majorHAnsi"/>
+      <w:rFonts w:ascii="Calibri" w:hAnsi="Calibri" w:eastAsia="" w:cs="" w:asciiTheme="majorHAnsi" w:cstheme="majorBidi" w:eastAsiaTheme="majorEastAsia" w:hAnsiTheme="majorHAnsi"/>
       <w:b/>
       <w:bCs/>
       <w:i/>
@@ -3451,7 +3488,7 @@
       <w:outlineLvl w:val="4"/>
     </w:pPr>
     <w:rPr>
-      <w:rFonts w:ascii="Calibri" w:hAnsi="Calibri" w:eastAsia="ＭＳ ゴシック" w:cs="" w:asciiTheme="majorHAnsi" w:cstheme="majorBidi" w:eastAsiaTheme="majorEastAsia" w:hAnsiTheme="majorHAnsi"/>
+      <w:rFonts w:ascii="Calibri" w:hAnsi="Calibri" w:eastAsia="" w:cs="" w:asciiTheme="majorHAnsi" w:cstheme="majorBidi" w:eastAsiaTheme="majorEastAsia" w:hAnsiTheme="majorHAnsi"/>
       <w:color w:themeColor="accent1" w:themeShade="7f" w:val="243F60"/>
     </w:rPr>
   </w:style>
@@ -3472,7 +3509,7 @@
       <w:outlineLvl w:val="5"/>
     </w:pPr>
     <w:rPr>
-      <w:rFonts w:ascii="Calibri" w:hAnsi="Calibri" w:eastAsia="ＭＳ ゴシック" w:cs="" w:asciiTheme="majorHAnsi" w:cstheme="majorBidi" w:eastAsiaTheme="majorEastAsia" w:hAnsiTheme="majorHAnsi"/>
+      <w:rFonts w:ascii="Calibri" w:hAnsi="Calibri" w:eastAsia="" w:cs="" w:asciiTheme="majorHAnsi" w:cstheme="majorBidi" w:eastAsiaTheme="majorEastAsia" w:hAnsiTheme="majorHAnsi"/>
       <w:i/>
       <w:iCs/>
       <w:color w:themeColor="accent1" w:themeShade="7f" w:val="243F60"/>
@@ -3495,7 +3532,7 @@
       <w:outlineLvl w:val="6"/>
     </w:pPr>
     <w:rPr>
-      <w:rFonts w:ascii="Calibri" w:hAnsi="Calibri" w:eastAsia="ＭＳ ゴシック" w:cs="" w:asciiTheme="majorHAnsi" w:cstheme="majorBidi" w:eastAsiaTheme="majorEastAsia" w:hAnsiTheme="majorHAnsi"/>
+      <w:rFonts w:ascii="Calibri" w:hAnsi="Calibri" w:eastAsia="" w:cs="" w:asciiTheme="majorHAnsi" w:cstheme="majorBidi" w:eastAsiaTheme="majorEastAsia" w:hAnsiTheme="majorHAnsi"/>
       <w:i/>
       <w:iCs/>
       <w:color w:themeColor="text1" w:themeTint="bf" w:val="404040"/>
@@ -3518,7 +3555,7 @@
       <w:outlineLvl w:val="7"/>
     </w:pPr>
     <w:rPr>
-      <w:rFonts w:ascii="Calibri" w:hAnsi="Calibri" w:eastAsia="ＭＳ ゴシック" w:cs="" w:asciiTheme="majorHAnsi" w:cstheme="majorBidi" w:eastAsiaTheme="majorEastAsia" w:hAnsiTheme="majorHAnsi"/>
+      <w:rFonts w:ascii="Calibri" w:hAnsi="Calibri" w:eastAsia="" w:cs="" w:asciiTheme="majorHAnsi" w:cstheme="majorBidi" w:eastAsiaTheme="majorEastAsia" w:hAnsiTheme="majorHAnsi"/>
       <w:color w:themeColor="accent1" w:val="4F81BD"/>
       <w:sz w:val="20"/>
       <w:szCs w:val="20"/>
@@ -3541,7 +3578,7 @@
       <w:outlineLvl w:val="8"/>
     </w:pPr>
     <w:rPr>
-      <w:rFonts w:ascii="Calibri" w:hAnsi="Calibri" w:eastAsia="ＭＳ ゴシック" w:cs="" w:asciiTheme="majorHAnsi" w:cstheme="majorBidi" w:eastAsiaTheme="majorEastAsia" w:hAnsiTheme="majorHAnsi"/>
+      <w:rFonts w:ascii="Calibri" w:hAnsi="Calibri" w:eastAsia="" w:cs="" w:asciiTheme="majorHAnsi" w:cstheme="majorBidi" w:eastAsiaTheme="majorEastAsia" w:hAnsiTheme="majorHAnsi"/>
       <w:i/>
       <w:iCs/>
       <w:color w:themeColor="text1" w:themeTint="bf" w:val="404040"/>
@@ -3580,7 +3617,7 @@
     <w:qFormat/>
     <w:rsid w:val="00fc693f"/>
     <w:rPr>
-      <w:rFonts w:ascii="Calibri" w:hAnsi="Calibri" w:eastAsia="ＭＳ ゴシック" w:cs="" w:asciiTheme="majorHAnsi" w:cstheme="majorBidi" w:eastAsiaTheme="majorEastAsia" w:hAnsiTheme="majorHAnsi"/>
+      <w:rFonts w:ascii="Calibri" w:hAnsi="Calibri" w:eastAsia="" w:cs="" w:asciiTheme="majorHAnsi" w:cstheme="majorBidi" w:eastAsiaTheme="majorEastAsia" w:hAnsiTheme="majorHAnsi"/>
       <w:b/>
       <w:bCs/>
       <w:color w:themeColor="accent1" w:themeShade="bf" w:val="365F91"/>
@@ -3595,7 +3632,7 @@
     <w:qFormat/>
     <w:rsid w:val="00fc693f"/>
     <w:rPr>
-      <w:rFonts w:ascii="Calibri" w:hAnsi="Calibri" w:eastAsia="ＭＳ ゴシック" w:cs="" w:asciiTheme="majorHAnsi" w:cstheme="majorBidi" w:eastAsiaTheme="majorEastAsia" w:hAnsiTheme="majorHAnsi"/>
+      <w:rFonts w:ascii="Calibri" w:hAnsi="Calibri" w:eastAsia="" w:cs="" w:asciiTheme="majorHAnsi" w:cstheme="majorBidi" w:eastAsiaTheme="majorEastAsia" w:hAnsiTheme="majorHAnsi"/>
       <w:b/>
       <w:bCs/>
       <w:color w:themeColor="accent1" w:val="4F81BD"/>
@@ -3610,7 +3647,7 @@
     <w:qFormat/>
     <w:rsid w:val="00fc693f"/>
     <w:rPr>
-      <w:rFonts w:ascii="Calibri" w:hAnsi="Calibri" w:eastAsia="ＭＳ ゴシック" w:cs="" w:asciiTheme="majorHAnsi" w:cstheme="majorBidi" w:eastAsiaTheme="majorEastAsia" w:hAnsiTheme="majorHAnsi"/>
+      <w:rFonts w:ascii="Calibri" w:hAnsi="Calibri" w:eastAsia="" w:cs="" w:asciiTheme="majorHAnsi" w:cstheme="majorBidi" w:eastAsiaTheme="majorEastAsia" w:hAnsiTheme="majorHAnsi"/>
       <w:b/>
       <w:bCs/>
       <w:color w:themeColor="accent1" w:val="4F81BD"/>
@@ -3623,7 +3660,7 @@
     <w:qFormat/>
     <w:rsid w:val="00fc693f"/>
     <w:rPr>
-      <w:rFonts w:ascii="Calibri" w:hAnsi="Calibri" w:eastAsia="ＭＳ ゴシック" w:cs="" w:asciiTheme="majorHAnsi" w:cstheme="majorBidi" w:eastAsiaTheme="majorEastAsia" w:hAnsiTheme="majorHAnsi"/>
+      <w:rFonts w:ascii="Calibri" w:hAnsi="Calibri" w:eastAsia="" w:cs="" w:asciiTheme="majorHAnsi" w:cstheme="majorBidi" w:eastAsiaTheme="majorEastAsia" w:hAnsiTheme="majorHAnsi"/>
       <w:color w:themeColor="text2" w:themeShade="bf" w:val="17365D"/>
       <w:spacing w:val="5"/>
       <w:kern w:val="2"/>
@@ -3638,7 +3675,7 @@
     <w:qFormat/>
     <w:rsid w:val="00fc693f"/>
     <w:rPr>
-      <w:rFonts w:ascii="Calibri" w:hAnsi="Calibri" w:eastAsia="ＭＳ ゴシック" w:cs="" w:asciiTheme="majorHAnsi" w:cstheme="majorBidi" w:eastAsiaTheme="majorEastAsia" w:hAnsiTheme="majorHAnsi"/>
+      <w:rFonts w:ascii="Calibri" w:hAnsi="Calibri" w:eastAsia="" w:cs="" w:asciiTheme="majorHAnsi" w:cstheme="majorBidi" w:eastAsiaTheme="majorEastAsia" w:hAnsiTheme="majorHAnsi"/>
       <w:i/>
       <w:iCs/>
       <w:color w:themeColor="accent1" w:val="4F81BD"/>
@@ -3710,7 +3747,7 @@
     <w:qFormat/>
     <w:rsid w:val="00fc693f"/>
     <w:rPr>
-      <w:rFonts w:ascii="Calibri" w:hAnsi="Calibri" w:eastAsia="ＭＳ ゴシック" w:cs="" w:asciiTheme="majorHAnsi" w:cstheme="majorBidi" w:eastAsiaTheme="majorEastAsia" w:hAnsiTheme="majorHAnsi"/>
+      <w:rFonts w:ascii="Calibri" w:hAnsi="Calibri" w:eastAsia="" w:cs="" w:asciiTheme="majorHAnsi" w:cstheme="majorBidi" w:eastAsiaTheme="majorEastAsia" w:hAnsiTheme="majorHAnsi"/>
       <w:b/>
       <w:bCs/>
       <w:i/>
@@ -3726,7 +3763,7 @@
     <w:qFormat/>
     <w:rsid w:val="00fc693f"/>
     <w:rPr>
-      <w:rFonts w:ascii="Calibri" w:hAnsi="Calibri" w:eastAsia="ＭＳ ゴシック" w:cs="" w:asciiTheme="majorHAnsi" w:cstheme="majorBidi" w:eastAsiaTheme="majorEastAsia" w:hAnsiTheme="majorHAnsi"/>
+      <w:rFonts w:ascii="Calibri" w:hAnsi="Calibri" w:eastAsia="" w:cs="" w:asciiTheme="majorHAnsi" w:cstheme="majorBidi" w:eastAsiaTheme="majorEastAsia" w:hAnsiTheme="majorHAnsi"/>
       <w:color w:themeColor="accent1" w:themeShade="7f" w:val="243F60"/>
     </w:rPr>
   </w:style>
@@ -3738,7 +3775,7 @@
     <w:qFormat/>
     <w:rsid w:val="00fc693f"/>
     <w:rPr>
-      <w:rFonts w:ascii="Calibri" w:hAnsi="Calibri" w:eastAsia="ＭＳ ゴシック" w:cs="" w:asciiTheme="majorHAnsi" w:cstheme="majorBidi" w:eastAsiaTheme="majorEastAsia" w:hAnsiTheme="majorHAnsi"/>
+      <w:rFonts w:ascii="Calibri" w:hAnsi="Calibri" w:eastAsia="" w:cs="" w:asciiTheme="majorHAnsi" w:cstheme="majorBidi" w:eastAsiaTheme="majorEastAsia" w:hAnsiTheme="majorHAnsi"/>
       <w:i/>
       <w:iCs/>
       <w:color w:themeColor="accent1" w:themeShade="7f" w:val="243F60"/>
@@ -3752,7 +3789,7 @@
     <w:qFormat/>
     <w:rsid w:val="00fc693f"/>
     <w:rPr>
-      <w:rFonts w:ascii="Calibri" w:hAnsi="Calibri" w:eastAsia="ＭＳ ゴシック" w:cs="" w:asciiTheme="majorHAnsi" w:cstheme="majorBidi" w:eastAsiaTheme="majorEastAsia" w:hAnsiTheme="majorHAnsi"/>
+      <w:rFonts w:ascii="Calibri" w:hAnsi="Calibri" w:eastAsia="" w:cs="" w:asciiTheme="majorHAnsi" w:cstheme="majorBidi" w:eastAsiaTheme="majorEastAsia" w:hAnsiTheme="majorHAnsi"/>
       <w:i/>
       <w:iCs/>
       <w:color w:themeColor="text1" w:themeTint="bf" w:val="404040"/>
@@ -3766,7 +3803,7 @@
     <w:qFormat/>
     <w:rsid w:val="00fc693f"/>
     <w:rPr>
-      <w:rFonts w:ascii="Calibri" w:hAnsi="Calibri" w:eastAsia="ＭＳ ゴシック" w:cs="" w:asciiTheme="majorHAnsi" w:cstheme="majorBidi" w:eastAsiaTheme="majorEastAsia" w:hAnsiTheme="majorHAnsi"/>
+      <w:rFonts w:ascii="Calibri" w:hAnsi="Calibri" w:eastAsia="" w:cs="" w:asciiTheme="majorHAnsi" w:cstheme="majorBidi" w:eastAsiaTheme="majorEastAsia" w:hAnsiTheme="majorHAnsi"/>
       <w:color w:themeColor="accent1" w:val="4F81BD"/>
       <w:sz w:val="20"/>
       <w:szCs w:val="20"/>
@@ -3780,7 +3817,7 @@
     <w:qFormat/>
     <w:rsid w:val="00fc693f"/>
     <w:rPr>
-      <w:rFonts w:ascii="Calibri" w:hAnsi="Calibri" w:eastAsia="ＭＳ ゴシック" w:cs="" w:asciiTheme="majorHAnsi" w:cstheme="majorBidi" w:eastAsiaTheme="majorEastAsia" w:hAnsiTheme="majorHAnsi"/>
+      <w:rFonts w:ascii="Calibri" w:hAnsi="Calibri" w:eastAsia="" w:cs="" w:asciiTheme="majorHAnsi" w:cstheme="majorBidi" w:eastAsiaTheme="majorEastAsia" w:hAnsiTheme="majorHAnsi"/>
       <w:i/>
       <w:iCs/>
       <w:color w:themeColor="text1" w:themeTint="bf" w:val="404040"/>
@@ -3962,6 +3999,28 @@
       <w:rFonts w:cs="Arial"/>
     </w:rPr>
   </w:style>
+  <w:style w:type="paragraph" w:styleId="Titreuser">
+    <w:name w:val="Titre (user)"/>
+    <w:basedOn w:val="Normal"/>
+    <w:next w:val="BodyText"/>
+    <w:qFormat/>
+    <w:pPr>
+      <w:keepNext w:val="true"/>
+      <w:spacing w:before="240" w:after="120"/>
+    </w:pPr>
+    <w:rPr>
+      <w:rFonts w:ascii="Liberation Sans" w:hAnsi="Liberation Sans" w:eastAsia="Microsoft YaHei" w:cs="Arial"/>
+      <w:sz w:val="28"/>
+      <w:szCs w:val="28"/>
+    </w:rPr>
+  </w:style>
+  <w:style w:type="paragraph" w:styleId="En-tteetpieddepageuser">
+    <w:name w:val="En-tête et pied de page (user)"/>
+    <w:basedOn w:val="Normal"/>
+    <w:qFormat/>
+    <w:pPr/>
+    <w:rPr/>
+  </w:style>
   <w:style w:type="paragraph" w:styleId="En-tteetpieddepage">
     <w:name w:val="En-tête et pied de page"/>
     <w:basedOn w:val="Normal"/>
@@ -4010,12 +4069,13 @@
     <w:rsid w:val="00fc693f"/>
     <w:pPr>
       <w:widowControl/>
+      <w:suppressAutoHyphens w:val="true"/>
       <w:bidi w:val="0"/>
       <w:spacing w:lineRule="auto" w:line="240" w:before="0" w:after="0"/>
       <w:jc w:val="start"/>
     </w:pPr>
     <w:rPr>
-      <w:rFonts w:ascii="Cambria" w:hAnsi="Cambria" w:eastAsia="ＭＳ 明朝" w:cs="" w:asciiTheme="minorHAnsi" w:cstheme="minorBidi" w:eastAsiaTheme="minorEastAsia" w:hAnsiTheme="minorHAnsi"/>
+      <w:rFonts w:ascii="Cambria" w:hAnsi="Cambria" w:eastAsia="" w:cs="" w:asciiTheme="minorHAnsi" w:cstheme="minorBidi" w:eastAsiaTheme="minorEastAsia" w:hAnsiTheme="minorHAnsi"/>
       <w:color w:val="auto"/>
       <w:kern w:val="0"/>
       <w:sz w:val="22"/>
@@ -4037,7 +4097,7 @@
       <w:contextualSpacing/>
     </w:pPr>
     <w:rPr>
-      <w:rFonts w:ascii="Calibri" w:hAnsi="Calibri" w:eastAsia="ＭＳ ゴシック" w:cs="" w:asciiTheme="majorHAnsi" w:cstheme="majorBidi" w:eastAsiaTheme="majorEastAsia" w:hAnsiTheme="majorHAnsi"/>
+      <w:rFonts w:ascii="Calibri" w:hAnsi="Calibri" w:eastAsia="" w:cs="" w:asciiTheme="majorHAnsi" w:cstheme="majorBidi" w:eastAsiaTheme="majorEastAsia" w:hAnsiTheme="majorHAnsi"/>
       <w:b/>
       <w:color w:val="000000"/>
       <w:spacing w:val="5"/>
@@ -4057,7 +4117,7 @@
     <w:rsid w:val="00fc693f"/>
     <w:pPr/>
     <w:rPr>
-      <w:rFonts w:ascii="Calibri" w:hAnsi="Calibri" w:eastAsia="ＭＳ ゴシック" w:cs="" w:asciiTheme="majorHAnsi" w:cstheme="majorBidi" w:eastAsiaTheme="majorEastAsia" w:hAnsiTheme="majorHAnsi"/>
+      <w:rFonts w:ascii="Calibri" w:hAnsi="Calibri" w:eastAsia="" w:cs="" w:asciiTheme="majorHAnsi" w:cstheme="majorBidi" w:eastAsiaTheme="majorEastAsia" w:hAnsiTheme="majorHAnsi"/>
       <w:i/>
       <w:iCs/>
       <w:color w:themeColor="accent1" w:val="4F81BD"/>
@@ -4290,12 +4350,13 @@
         <w:tab w:val="left" w:pos="3456" w:leader="none"/>
         <w:tab w:val="left" w:pos="4032" w:leader="none"/>
       </w:tabs>
+      <w:suppressAutoHyphens w:val="true"/>
       <w:bidi w:val="0"/>
       <w:spacing w:lineRule="auto" w:line="276" w:before="0" w:after="200"/>
       <w:jc w:val="start"/>
     </w:pPr>
     <w:rPr>
-      <w:rFonts w:ascii="Courier" w:hAnsi="Courier" w:eastAsia="ＭＳ 明朝" w:cs="" w:cstheme="minorBidi" w:eastAsiaTheme="minorEastAsia"/>
+      <w:rFonts w:ascii="Courier" w:hAnsi="Courier" w:eastAsia="" w:cs="" w:cstheme="minorBidi" w:eastAsiaTheme="minorEastAsia"/>
       <w:color w:val="auto"/>
       <w:kern w:val="0"/>
       <w:sz w:val="20"/>
@@ -4343,7 +4404,7 @@
   </w:style>
   <w:style w:type="paragraph" w:styleId="IndexHeading">
     <w:name w:val="index heading"/>
-    <w:basedOn w:val="Titre"/>
+    <w:basedOn w:val="Titreuser"/>
     <w:pPr/>
     <w:rPr/>
   </w:style>
@@ -4361,8 +4422,8 @@
     </w:pPr>
     <w:rPr/>
   </w:style>
-  <w:style w:type="numbering" w:styleId="Pasdeliste" w:default="1">
-    <w:name w:val="Pas de liste"/>
+  <w:style w:type="numbering" w:styleId="Pasdelisteuser" w:default="1">
+    <w:name w:val="Pas de liste (user)"/>
     <w:uiPriority w:val="99"/>
     <w:semiHidden/>
     <w:unhideWhenUsed/>
@@ -7493,7 +7554,6 @@
       <w:pPr>
         <w:spacing w:before="0" w:after="0" w:line="240" w:lineRule="auto"/>
       </w:pPr>
-      <w:rPr/>
       <w:tblPr/>
       <w:tcPr>
         <w:tcBorders>
@@ -7639,7 +7699,6 @@
       <w:pPr>
         <w:spacing w:before="0" w:after="0" w:line="240" w:lineRule="auto"/>
       </w:pPr>
-      <w:rPr/>
       <w:tblPr/>
       <w:tcPr>
         <w:tcBorders>
@@ -7785,7 +7844,6 @@
       <w:pPr>
         <w:spacing w:before="0" w:after="0" w:line="240" w:lineRule="auto"/>
       </w:pPr>
-      <w:rPr/>
       <w:tblPr/>
       <w:tcPr>
         <w:tcBorders>
@@ -7931,7 +7989,6 @@
       <w:pPr>
         <w:spacing w:before="0" w:after="0" w:line="240" w:lineRule="auto"/>
       </w:pPr>
-      <w:rPr/>
       <w:tblPr/>
       <w:tcPr>
         <w:tcBorders>
@@ -8077,7 +8134,6 @@
       <w:pPr>
         <w:spacing w:before="0" w:after="0" w:line="240" w:lineRule="auto"/>
       </w:pPr>
-      <w:rPr/>
       <w:tblPr/>
       <w:tcPr>
         <w:tcBorders>
@@ -8223,7 +8279,6 @@
       <w:pPr>
         <w:spacing w:before="0" w:after="0" w:line="240" w:lineRule="auto"/>
       </w:pPr>
-      <w:rPr/>
       <w:tblPr/>
       <w:tcPr>
         <w:tcBorders>
@@ -8369,7 +8424,6 @@
       <w:pPr>
         <w:spacing w:before="0" w:after="0" w:line="240" w:lineRule="auto"/>
       </w:pPr>
-      <w:rPr/>
       <w:tblPr/>
       <w:tcPr>
         <w:tcBorders>

</xml_diff>